<commit_message>
elimnar personas nunca evaluadas
</commit_message>
<xml_diff>
--- a/plantillas/MANUAL_DESARROLLADOR.docx
+++ b/plantillas/MANUAL_DESARROLLADOR.docx
@@ -15578,7 +15578,23 @@
                 <w:sz w:val="19"/>
                 <w:szCs w:val="19"/>
               </w:rPr>
-              <w:t xml:space="preserve">{pais, centro_id, modo, persona_id, conservar} → vista previa </w:t>
+              <w:t xml:space="preserve">{pais, centro_id, modo, persona_id, conservar} (</w:t>
+            </w:r>
+            <w:r>
+              <w:rPr>
+                <w:rFonts w:ascii="Consolas" w:eastAsia="Consolas" w:hAnsi="Consolas" w:cs="Consolas"/>
+                <w:color w:val="B42318"/>
+                <w:sz w:val="19"/>
+                <w:szCs w:val="19"/>
+              </w:rPr>
+              <w:t xml:space="preserve">conservar</w:t>
+            </w:r>
+            <w:r>
+              <w:rPr>
+                <w:sz w:val="19"/>
+                <w:szCs w:val="19"/>
+              </w:rPr>
+              <w:t xml:space="preserve">: {«AAAA-MM-DD|PESQUISA»: nº de carga}) → vista previa </w:t>
             </w:r>
             <w:r>
               <w:rPr>
@@ -15862,29 +15878,137 @@
         <w:spacing w:after="60"/>
       </w:pPr>
       <w:r>
-        <w:t xml:space="preserve">Una </w:t>
+        <w:t xml:space="preserve">Las mediciones se clasifican por </w:t>
       </w:r>
       <w:r>
         <w:rPr>
           <w:b/>
           <w:bCs/>
         </w:rPr>
-        <w:t xml:space="preserve">carga</w:t>
-      </w:r>
-      <w:r>
-        <w:t xml:space="preserve"> es el conjunto de filas con el mismo </w:t>
-      </w:r>
-      <w:r>
-        <w:rPr>
-          <w:rFonts w:ascii="Consolas" w:eastAsia="Consolas" w:hAnsi="Consolas" w:cs="Consolas"/>
-          <w:color w:val="B42318"/>
-          <w:sz w:val="19"/>
-          <w:szCs w:val="19"/>
-        </w:rPr>
-        <w:t xml:space="preserve">control_fecha_creacion</w:t>
-      </w:r>
-      <w:r>
-        <w:t xml:space="preserve"> (el instante en que se guardó el Excel). En el detalle, las cargas de cada fecha se numeran desde 1 en orden cronológico.</w:t>
+        <w:t xml:space="preserve">pesquisa</w:t>
+      </w:r>
+      <w:r>
+        <w:t xml:space="preserve"> con </w:t>
+      </w:r>
+      <w:r>
+        <w:rPr>
+          <w:rFonts w:ascii="Consolas" w:eastAsia="Consolas" w:hAnsi="Consolas" w:cs="Consolas"/>
+          <w:color w:val="B42318"/>
+          <w:sz w:val="19"/>
+          <w:szCs w:val="19"/>
+        </w:rPr>
+        <w:t xml:space="preserve">psi_tipo_pesquisas.tipo_pesquisa_grupo</w:t>
+      </w:r>
+      <w:r>
+        <w:t xml:space="preserve"> (</w:t>
+      </w:r>
+      <w:r>
+        <w:rPr>
+          <w:rFonts w:ascii="Consolas" w:eastAsia="Consolas" w:hAnsi="Consolas" w:cs="Consolas"/>
+          <w:color w:val="B42318"/>
+          <w:sz w:val="19"/>
+          <w:szCs w:val="19"/>
+        </w:rPr>
+        <w:t xml:space="preserve">LEFT JOIN</w:t>
+      </w:r>
+      <w:r>
+        <w:t xml:space="preserve">; si es nulo se usa </w:t>
+      </w:r>
+      <w:r>
+        <w:rPr>
+          <w:rFonts w:ascii="Consolas" w:eastAsia="Consolas" w:hAnsi="Consolas" w:cs="Consolas"/>
+          <w:color w:val="B42318"/>
+          <w:sz w:val="19"/>
+          <w:szCs w:val="19"/>
+        </w:rPr>
+        <w:t xml:space="preserve">SIN_PESQUISA</w:t>
+      </w:r>
+      <w:r>
+        <w:t xml:space="preserve">). Solo se compara dentro de la misma pesquisa: PESO y HEMOGLOBINA nunca compiten entre sí. </w:t>
+      </w:r>
+      <w:r>
+        <w:rPr>
+          <w:rFonts w:ascii="Consolas" w:eastAsia="Consolas" w:hAnsi="Consolas" w:cs="Consolas"/>
+          <w:color w:val="B42318"/>
+          <w:sz w:val="19"/>
+          <w:szCs w:val="19"/>
+        </w:rPr>
+        <w:t xml:space="preserve">ETIQUETAS_PESQUISA</w:t>
+      </w:r>
+      <w:r>
+        <w:t xml:space="preserve"> traduce el grupo a texto (</w:t>
+      </w:r>
+      <w:r>
+        <w:rPr>
+          <w:rFonts w:ascii="Consolas" w:eastAsia="Consolas" w:hAnsi="Consolas" w:cs="Consolas"/>
+          <w:color w:val="B42318"/>
+          <w:sz w:val="19"/>
+          <w:szCs w:val="19"/>
+        </w:rPr>
+        <w:t xml:space="preserve">ANTROPOMETRICO</w:t>
+      </w:r>
+      <w:r>
+        <w:t xml:space="preserve">, </w:t>
+      </w:r>
+      <w:r>
+        <w:rPr>
+          <w:rFonts w:ascii="Consolas" w:eastAsia="Consolas" w:hAnsi="Consolas" w:cs="Consolas"/>
+          <w:color w:val="B42318"/>
+          <w:sz w:val="19"/>
+          <w:szCs w:val="19"/>
+        </w:rPr>
+        <w:t xml:space="preserve">SANGUINEO</w:t>
+      </w:r>
+      <w:r>
+        <w:t xml:space="preserve">, </w:t>
+      </w:r>
+      <w:r>
+        <w:rPr>
+          <w:rFonts w:ascii="Consolas" w:eastAsia="Consolas" w:hAnsi="Consolas" w:cs="Consolas"/>
+          <w:color w:val="B42318"/>
+          <w:sz w:val="19"/>
+          <w:szCs w:val="19"/>
+        </w:rPr>
+        <w:t xml:space="preserve">LABORATORIO</w:t>
+      </w:r>
+      <w:r>
+        <w:t xml:space="preserve">, </w:t>
+      </w:r>
+      <w:r>
+        <w:rPr>
+          <w:rFonts w:ascii="Consolas" w:eastAsia="Consolas" w:hAnsi="Consolas" w:cs="Consolas"/>
+          <w:color w:val="B42318"/>
+          <w:sz w:val="19"/>
+          <w:szCs w:val="19"/>
+        </w:rPr>
+        <w:t xml:space="preserve">VITALES</w:t>
+      </w:r>
+      <w:r>
+        <w:t xml:space="preserve">, </w:t>
+      </w:r>
+      <w:r>
+        <w:rPr>
+          <w:rFonts w:ascii="Consolas" w:eastAsia="Consolas" w:hAnsi="Consolas" w:cs="Consolas"/>
+          <w:color w:val="B42318"/>
+          <w:sz w:val="19"/>
+          <w:szCs w:val="19"/>
+        </w:rPr>
+        <w:t xml:space="preserve">MEDICINA_GENERAL_PEDIATRIA</w:t>
+      </w:r>
+      <w:r>
+        <w:t xml:space="preserve">, </w:t>
+      </w:r>
+      <w:r>
+        <w:rPr>
+          <w:rFonts w:ascii="Consolas" w:eastAsia="Consolas" w:hAnsi="Consolas" w:cs="Consolas"/>
+          <w:color w:val="B42318"/>
+          <w:sz w:val="19"/>
+          <w:szCs w:val="19"/>
+        </w:rPr>
+        <w:t xml:space="preserve">VACUNACION</w:t>
+      </w:r>
+      <w:r>
+        <w:t xml:space="preserve">); un grupo no mapeado se muestra con su nombre capitalizado.</w:t>
       </w:r>
     </w:p>
     <w:p>
@@ -15897,39 +16021,39 @@
         <w:spacing w:after="60"/>
       </w:pPr>
       <w:r>
-        <w:t xml:space="preserve">Un grupo es </w:t>
+        <w:t xml:space="preserve">Una </w:t>
       </w:r>
       <w:r>
         <w:rPr>
           <w:b/>
           <w:bCs/>
         </w:rPr>
-        <w:t xml:space="preserve">idéntico</w:t>
-      </w:r>
-      <w:r>
-        <w:t xml:space="preserve"> si todas sus filas tienen el mismo valor (se compara con </w:t>
-      </w:r>
-      <w:r>
-        <w:rPr>
-          <w:rFonts w:ascii="Consolas" w:eastAsia="Consolas" w:hAnsi="Consolas" w:cs="Consolas"/>
-          <w:color w:val="B42318"/>
-          <w:sz w:val="19"/>
-          <w:szCs w:val="19"/>
-        </w:rPr>
-        <w:t xml:space="preserve">strip()</w:t>
-      </w:r>
-      <w:r>
-        <w:t xml:space="preserve">) y de </w:t>
+        <w:t xml:space="preserve">carga</w:t>
+      </w:r>
+      <w:r>
+        <w:t xml:space="preserve"> es el conjunto de filas </w:t>
       </w:r>
       <w:r>
         <w:rPr>
           <w:b/>
           <w:bCs/>
         </w:rPr>
-        <w:t xml:space="preserve">valores distintos</w:t>
-      </w:r>
-      <w:r>
-        <w:t xml:space="preserve"> si no: en ese caso hay que decidir qué carga se conserva.</w:t>
+        <w:t xml:space="preserve">de una pesquisa</w:t>
+      </w:r>
+      <w:r>
+        <w:t xml:space="preserve"> con el mismo </w:t>
+      </w:r>
+      <w:r>
+        <w:rPr>
+          <w:rFonts w:ascii="Consolas" w:eastAsia="Consolas" w:hAnsi="Consolas" w:cs="Consolas"/>
+          <w:color w:val="B42318"/>
+          <w:sz w:val="19"/>
+          <w:szCs w:val="19"/>
+        </w:rPr>
+        <w:t xml:space="preserve">control_fecha_creacion</w:t>
+      </w:r>
+      <w:r>
+        <w:t xml:space="preserve"> (el instante en que se guardó el Excel). En el detalle, las cargas se numeran desde 1 en orden cronológico dentro de cada fecha y pesquisa.</w:t>
       </w:r>
     </w:p>
     <w:p>
@@ -15942,40 +16066,39 @@
         <w:spacing w:after="60"/>
       </w:pPr>
       <w:r>
-        <w:t xml:space="preserve">No hay FK ni triggers sobre </w:t>
-      </w:r>
-      <w:r>
-        <w:rPr>
-          <w:rFonts w:ascii="Consolas" w:eastAsia="Consolas" w:hAnsi="Consolas" w:cs="Consolas"/>
-          <w:color w:val="B42318"/>
-          <w:sz w:val="19"/>
-          <w:szCs w:val="19"/>
-        </w:rPr>
-        <w:t xml:space="preserve">psi_pesquisas_x_centro</w:t>
-      </w:r>
-      <w:r>
-        <w:t xml:space="preserve">: el </w:t>
-      </w:r>
-      <w:r>
-        <w:rPr>
-          <w:rFonts w:ascii="Consolas" w:eastAsia="Consolas" w:hAnsi="Consolas" w:cs="Consolas"/>
-          <w:color w:val="B42318"/>
-          <w:sz w:val="19"/>
-          <w:szCs w:val="19"/>
-        </w:rPr>
-        <w:t xml:space="preserve">DELETE</w:t>
-      </w:r>
-      <w:r>
-        <w:t xml:space="preserve"> no arrastra nada ni hay tablas hijas que trasladar (a diferencia de 7.9).</w:t>
-      </w:r>
-    </w:p>
-    <w:p>
-      <w:pPr>
-        <w:pStyle w:val="Ttulo3"/>
-        <w:keepNext/>
-      </w:pPr>
-      <w:r>
-        <w:t xml:space="preserve">Servicio (evaluaciones_duplicadas.py)</w:t>
+        <w:t xml:space="preserve">Un grupo es </w:t>
+      </w:r>
+      <w:r>
+        <w:rPr>
+          <w:b/>
+          <w:bCs/>
+        </w:rPr>
+        <w:t xml:space="preserve">idéntico</w:t>
+      </w:r>
+      <w:r>
+        <w:t xml:space="preserve"> si todas sus filas tienen el mismo valor (se compara con </w:t>
+      </w:r>
+      <w:r>
+        <w:rPr>
+          <w:rFonts w:ascii="Consolas" w:eastAsia="Consolas" w:hAnsi="Consolas" w:cs="Consolas"/>
+          <w:color w:val="B42318"/>
+          <w:sz w:val="19"/>
+          <w:szCs w:val="19"/>
+        </w:rPr>
+        <w:t xml:space="preserve">strip()</w:t>
+      </w:r>
+      <w:r>
+        <w:t xml:space="preserve">) y de </w:t>
+      </w:r>
+      <w:r>
+        <w:rPr>
+          <w:b/>
+          <w:bCs/>
+        </w:rPr>
+        <w:t xml:space="preserve">valores distintos</w:t>
+      </w:r>
+      <w:r>
+        <w:t xml:space="preserve"> si no: en ese caso hay que decidir qué carga se conserva.</w:t>
       </w:r>
     </w:p>
     <w:p>
@@ -15988,40 +16111,40 @@
         <w:spacing w:after="60"/>
       </w:pPr>
       <w:r>
-        <w:rPr>
-          <w:rFonts w:ascii="Consolas" w:eastAsia="Consolas" w:hAnsi="Consolas" w:cs="Consolas"/>
-          <w:color w:val="B42318"/>
-          <w:sz w:val="19"/>
-          <w:szCs w:val="19"/>
-        </w:rPr>
-        <w:t xml:space="preserve">listar_clientes(cursor)</w:t>
-      </w:r>
-      <w:r>
-        <w:t xml:space="preserve"> y </w:t>
-      </w:r>
-      <w:r>
-        <w:rPr>
-          <w:rFonts w:ascii="Consolas" w:eastAsia="Consolas" w:hAnsi="Consolas" w:cs="Consolas"/>
-          <w:color w:val="B42318"/>
-          <w:sz w:val="19"/>
-          <w:szCs w:val="19"/>
-        </w:rPr>
-        <w:t xml:space="preserve">listar_centros(cursor, organizacion_id)</w:t>
-      </w:r>
-      <w:r>
-        <w:t xml:space="preserve">: alimentan los selectores Cliente y Centro. Cada centro trae sus mediciones sobrantes (</w:t>
-      </w:r>
-      <w:r>
-        <w:rPr>
-          <w:rFonts w:ascii="Consolas" w:eastAsia="Consolas" w:hAnsi="Consolas" w:cs="Consolas"/>
-          <w:color w:val="B42318"/>
-          <w:sz w:val="19"/>
-          <w:szCs w:val="19"/>
-        </w:rPr>
-        <w:t xml:space="preserve">SUM(n - 1)</w:t>
-      </w:r>
-      <w:r>
-        <w:t xml:space="preserve"> de sus grupos repetidos).</w:t>
+        <w:t xml:space="preserve">No hay FK ni triggers sobre </w:t>
+      </w:r>
+      <w:r>
+        <w:rPr>
+          <w:rFonts w:ascii="Consolas" w:eastAsia="Consolas" w:hAnsi="Consolas" w:cs="Consolas"/>
+          <w:color w:val="B42318"/>
+          <w:sz w:val="19"/>
+          <w:szCs w:val="19"/>
+        </w:rPr>
+        <w:t xml:space="preserve">psi_pesquisas_x_centro</w:t>
+      </w:r>
+      <w:r>
+        <w:t xml:space="preserve">: el </w:t>
+      </w:r>
+      <w:r>
+        <w:rPr>
+          <w:rFonts w:ascii="Consolas" w:eastAsia="Consolas" w:hAnsi="Consolas" w:cs="Consolas"/>
+          <w:color w:val="B42318"/>
+          <w:sz w:val="19"/>
+          <w:szCs w:val="19"/>
+        </w:rPr>
+        <w:t xml:space="preserve">DELETE</w:t>
+      </w:r>
+      <w:r>
+        <w:t xml:space="preserve"> no arrastra nada ni hay tablas hijas que trasladar (a diferencia de 7.9).</w:t>
+      </w:r>
+    </w:p>
+    <w:p>
+      <w:pPr>
+        <w:pStyle w:val="Ttulo3"/>
+        <w:keepNext/>
+      </w:pPr>
+      <w:r>
+        <w:t xml:space="preserve">Servicio (evaluaciones_duplicadas.py)</w:t>
       </w:r>
     </w:p>
     <w:p>
@@ -16040,22 +16163,34 @@
           <w:sz w:val="19"/>
           <w:szCs w:val="19"/>
         </w:rPr>
-        <w:t xml:space="preserve">beneficiarios_del_centro(cursor, centro_id, incluir_sin_repetidas=False)</w:t>
-      </w:r>
-      <w:r>
-        <w:t xml:space="preserve">: una sola consulta agrupada por persona, tipo y fecha. Devuelve el resumen (beneficiarios con repetidas, grupos, sobrantes idénticas y distintas) y la lista ordenada por sobrantes. Con </w:t>
-      </w:r>
-      <w:r>
-        <w:rPr>
-          <w:rFonts w:ascii="Consolas" w:eastAsia="Consolas" w:hAnsi="Consolas" w:cs="Consolas"/>
-          <w:color w:val="B42318"/>
-          <w:sz w:val="19"/>
-          <w:szCs w:val="19"/>
-        </w:rPr>
-        <w:t xml:space="preserve">incluir_sin_repetidas</w:t>
-      </w:r>
-      <w:r>
-        <w:t xml:space="preserve"> suma a quienes no tienen repetidas.</w:t>
+        <w:t xml:space="preserve">listar_clientes(cursor)</w:t>
+      </w:r>
+      <w:r>
+        <w:t xml:space="preserve"> y </w:t>
+      </w:r>
+      <w:r>
+        <w:rPr>
+          <w:rFonts w:ascii="Consolas" w:eastAsia="Consolas" w:hAnsi="Consolas" w:cs="Consolas"/>
+          <w:color w:val="B42318"/>
+          <w:sz w:val="19"/>
+          <w:szCs w:val="19"/>
+        </w:rPr>
+        <w:t xml:space="preserve">listar_centros(cursor, organizacion_id)</w:t>
+      </w:r>
+      <w:r>
+        <w:t xml:space="preserve">: alimentan los selectores Cliente y Centro. Cada centro trae sus mediciones sobrantes (</w:t>
+      </w:r>
+      <w:r>
+        <w:rPr>
+          <w:rFonts w:ascii="Consolas" w:eastAsia="Consolas" w:hAnsi="Consolas" w:cs="Consolas"/>
+          <w:color w:val="B42318"/>
+          <w:sz w:val="19"/>
+          <w:szCs w:val="19"/>
+        </w:rPr>
+        <w:t xml:space="preserve">SUM(n - 1)</w:t>
+      </w:r>
+      <w:r>
+        <w:t xml:space="preserve"> de sus grupos repetidos).</w:t>
       </w:r>
     </w:p>
     <w:p>
@@ -16074,58 +16209,22 @@
           <w:sz w:val="19"/>
           <w:szCs w:val="19"/>
         </w:rPr>
-        <w:t xml:space="preserve">detalle_beneficiario(cursor, centro_id, persona_id)</w:t>
-      </w:r>
-      <w:r>
-        <w:t xml:space="preserve">: todas las filas vigentes de la persona en el centro, agrupadas por </w:t>
-      </w:r>
-      <w:r>
-        <w:rPr>
-          <w:rFonts w:ascii="Consolas" w:eastAsia="Consolas" w:hAnsi="Consolas" w:cs="Consolas"/>
-          <w:color w:val="B42318"/>
-          <w:sz w:val="19"/>
-          <w:szCs w:val="19"/>
-        </w:rPr>
-        <w:t xml:space="preserve">_agrupar</w:t>
-      </w:r>
-      <w:r>
-        <w:t xml:space="preserve"> (por fecha: cargas numeradas, filas por tipo y los indicadores </w:t>
-      </w:r>
-      <w:r>
-        <w:rPr>
-          <w:rFonts w:ascii="Consolas" w:eastAsia="Consolas" w:hAnsi="Consolas" w:cs="Consolas"/>
-          <w:color w:val="B42318"/>
-          <w:sz w:val="19"/>
-          <w:szCs w:val="19"/>
-        </w:rPr>
-        <w:t xml:space="preserve">repetida</w:t>
-      </w:r>
-      <w:r>
-        <w:t xml:space="preserve"> e </w:t>
-      </w:r>
-      <w:r>
-        <w:rPr>
-          <w:rFonts w:ascii="Consolas" w:eastAsia="Consolas" w:hAnsi="Consolas" w:cs="Consolas"/>
-          <w:color w:val="B42318"/>
-          <w:sz w:val="19"/>
-          <w:szCs w:val="19"/>
-        </w:rPr>
-        <w:t xml:space="preserve">identica</w:t>
-      </w:r>
-      <w:r>
-        <w:t xml:space="preserve">). Lanza </w:t>
-      </w:r>
-      <w:r>
-        <w:rPr>
-          <w:rFonts w:ascii="Consolas" w:eastAsia="Consolas" w:hAnsi="Consolas" w:cs="Consolas"/>
-          <w:color w:val="B42318"/>
-          <w:sz w:val="19"/>
-          <w:szCs w:val="19"/>
-        </w:rPr>
-        <w:t xml:space="preserve">EvaluacionesError</w:t>
-      </w:r>
-      <w:r>
-        <w:t xml:space="preserve"> si la persona no existe o no tiene evaluaciones en el centro.</w:t>
+        <w:t xml:space="preserve">beneficiarios_del_centro(cursor, centro_id, incluir_sin_repetidas=False)</w:t>
+      </w:r>
+      <w:r>
+        <w:t xml:space="preserve">: una sola consulta agrupada por persona, tipo y fecha. Devuelve el resumen (beneficiarios con repetidas, grupos, sobrantes idénticas y distintas) y la lista ordenada por sobrantes. Con </w:t>
+      </w:r>
+      <w:r>
+        <w:rPr>
+          <w:rFonts w:ascii="Consolas" w:eastAsia="Consolas" w:hAnsi="Consolas" w:cs="Consolas"/>
+          <w:color w:val="B42318"/>
+          <w:sz w:val="19"/>
+          <w:szCs w:val="19"/>
+        </w:rPr>
+        <w:t xml:space="preserve">incluir_sin_repetidas</w:t>
+      </w:r>
+      <w:r>
+        <w:t xml:space="preserve"> suma a quienes no tienen repetidas.</w:t>
       </w:r>
     </w:p>
     <w:p>
@@ -16144,6 +16243,112 @@
           <w:sz w:val="19"/>
           <w:szCs w:val="19"/>
         </w:rPr>
+        <w:t xml:space="preserve">detalle_beneficiario(cursor, centro_id, persona_id)</w:t>
+      </w:r>
+      <w:r>
+        <w:t xml:space="preserve">: todas las filas vigentes de la persona en el centro, agrupadas por </w:t>
+      </w:r>
+      <w:r>
+        <w:rPr>
+          <w:rFonts w:ascii="Consolas" w:eastAsia="Consolas" w:hAnsi="Consolas" w:cs="Consolas"/>
+          <w:color w:val="B42318"/>
+          <w:sz w:val="19"/>
+          <w:szCs w:val="19"/>
+        </w:rPr>
+        <w:t xml:space="preserve">_agrupar</w:t>
+      </w:r>
+      <w:r>
+        <w:t xml:space="preserve"> en </w:t>
+      </w:r>
+      <w:r>
+        <w:rPr>
+          <w:rFonts w:ascii="Consolas" w:eastAsia="Consolas" w:hAnsi="Consolas" w:cs="Consolas"/>
+          <w:color w:val="B42318"/>
+          <w:sz w:val="19"/>
+          <w:szCs w:val="19"/>
+        </w:rPr>
+        <w:t xml:space="preserve">fechas[].grupos[]</w:t>
+      </w:r>
+      <w:r>
+        <w:t xml:space="preserve"> (por fecha y pesquisa: </w:t>
+      </w:r>
+      <w:r>
+        <w:rPr>
+          <w:rFonts w:ascii="Consolas" w:eastAsia="Consolas" w:hAnsi="Consolas" w:cs="Consolas"/>
+          <w:color w:val="B42318"/>
+          <w:sz w:val="19"/>
+          <w:szCs w:val="19"/>
+        </w:rPr>
+        <w:t xml:space="preserve">grupo</w:t>
+      </w:r>
+      <w:r>
+        <w:t xml:space="preserve">, </w:t>
+      </w:r>
+      <w:r>
+        <w:rPr>
+          <w:rFonts w:ascii="Consolas" w:eastAsia="Consolas" w:hAnsi="Consolas" w:cs="Consolas"/>
+          <w:color w:val="B42318"/>
+          <w:sz w:val="19"/>
+          <w:szCs w:val="19"/>
+        </w:rPr>
+        <w:t xml:space="preserve">etiqueta</w:t>
+      </w:r>
+      <w:r>
+        <w:t xml:space="preserve">, cargas numeradas, filas por tipo y los indicadores </w:t>
+      </w:r>
+      <w:r>
+        <w:rPr>
+          <w:rFonts w:ascii="Consolas" w:eastAsia="Consolas" w:hAnsi="Consolas" w:cs="Consolas"/>
+          <w:color w:val="B42318"/>
+          <w:sz w:val="19"/>
+          <w:szCs w:val="19"/>
+        </w:rPr>
+        <w:t xml:space="preserve">repetida</w:t>
+      </w:r>
+      <w:r>
+        <w:t xml:space="preserve"> e </w:t>
+      </w:r>
+      <w:r>
+        <w:rPr>
+          <w:rFonts w:ascii="Consolas" w:eastAsia="Consolas" w:hAnsi="Consolas" w:cs="Consolas"/>
+          <w:color w:val="B42318"/>
+          <w:sz w:val="19"/>
+          <w:szCs w:val="19"/>
+        </w:rPr>
+        <w:t xml:space="preserve">identica</w:t>
+      </w:r>
+      <w:r>
+        <w:t xml:space="preserve">; la fecha agrega los de sus grupos). Lanza </w:t>
+      </w:r>
+      <w:r>
+        <w:rPr>
+          <w:rFonts w:ascii="Consolas" w:eastAsia="Consolas" w:hAnsi="Consolas" w:cs="Consolas"/>
+          <w:color w:val="B42318"/>
+          <w:sz w:val="19"/>
+          <w:szCs w:val="19"/>
+        </w:rPr>
+        <w:t xml:space="preserve">EvaluacionesError</w:t>
+      </w:r>
+      <w:r>
+        <w:t xml:space="preserve"> si la persona no existe o no tiene evaluaciones en el centro.</w:t>
+      </w:r>
+    </w:p>
+    <w:p>
+      <w:pPr>
+        <w:pStyle w:val="Prrafodelista"/>
+        <w:numPr>
+          <w:ilvl w:val="0"/>
+          <w:numId w:val="2"/>
+        </w:numPr>
+        <w:spacing w:after="60"/>
+      </w:pPr>
+      <w:r>
+        <w:rPr>
+          <w:rFonts w:ascii="Consolas" w:eastAsia="Consolas" w:hAnsi="Consolas" w:cs="Consolas"/>
+          <w:color w:val="B42318"/>
+          <w:sz w:val="19"/>
+          <w:szCs w:val="19"/>
+        </w:rPr>
         <w:t xml:space="preserve">construir_plan(cursor, centro_id, modo, persona_id=None, conservar=None, bloquear=False)</w:t>
       </w:r>
       <w:r>
@@ -16181,7 +16386,7 @@
         <w:t xml:space="preserve">seleccion</w:t>
       </w:r>
       <w:r>
-        <w:t xml:space="preserve"> (un beneficiario, eligiendo la carga de cada fecha) y </w:t>
+        <w:t xml:space="preserve"> (un beneficiario, eligiendo la carga de cada fecha y pesquisa) y </w:t>
       </w:r>
       <w:r>
         <w:rPr>
@@ -16452,7 +16657,7 @@
                 <w:sz w:val="19"/>
                 <w:szCs w:val="19"/>
               </w:rPr>
-              <w:t xml:space="preserve">Fecha repetida; </w:t>
+              <w:t xml:space="preserve">Fecha y pesquisa con repetidas; </w:t>
             </w:r>
             <w:r>
               <w:rPr>
@@ -16461,7 +16666,7 @@
                 <w:sz w:val="19"/>
                 <w:szCs w:val="19"/>
               </w:rPr>
-              <w:t xml:space="preserve">conservar[fecha]</w:t>
+              <w:t xml:space="preserve">conservar["AAAA-MM-DD|GRUPO"]</w:t>
             </w:r>
             <w:r>
               <w:rPr>
@@ -16592,7 +16797,7 @@
                 <w:sz w:val="19"/>
                 <w:szCs w:val="19"/>
               </w:rPr>
-              <w:t xml:space="preserve">Se conserva su fila más antigua: nunca se pierde un tipo de pesquisa</w:t>
+              <w:t xml:space="preserve">Se conserva su fila más antigua: nunca se pierde un tipo de medición</w:t>
             </w:r>
           </w:p>
         </w:tc>
@@ -16673,7 +16878,7 @@
                 <w:sz w:val="19"/>
                 <w:szCs w:val="19"/>
               </w:rPr>
-              <w:t xml:space="preserve"> apunta a una carga que no existe en esa fecha</w:t>
+              <w:t xml:space="preserve"> apunta a una carga que no existe en esa fecha y pesquisa</w:t>
             </w:r>
           </w:p>
         </w:tc>
@@ -16708,7 +16913,7 @@
                 <w:sz w:val="19"/>
                 <w:szCs w:val="19"/>
               </w:rPr>
-              <w:t xml:space="preserve">: «La carga elegida para el … no existe.»</w:t>
+              <w:t xml:space="preserve">: «La carga elegida para {pesquisa} del {fecha} no existe.»</w:t>
             </w:r>
           </w:p>
         </w:tc>
@@ -17296,7 +17501,7 @@
         <w:t xml:space="preserve">conservar</w:t>
       </w:r>
       <w:r>
-        <w:t xml:space="preserve"> son fechas ISO que solo se comparan en Python; nunca llegan al SQL.</w:t>
+        <w:t xml:space="preserve"> («AAAA-MM-DD|PESQUISA») solo se comparan en Python; nunca llegan al SQL.</w:t>
       </w:r>
     </w:p>
     <w:p>
@@ -17417,7 +17622,31 @@
         <w:spacing w:after="60"/>
       </w:pPr>
       <w:r>
-        <w:t xml:space="preserve">El detalle muestra las cargas lado a lado con un radio por carga y fecha. </w:t>
+        <w:t xml:space="preserve">El detalle muestra una tarjeta por fecha y pesquisa con repetidas (</w:t>
+      </w:r>
+      <w:r>
+        <w:rPr>
+          <w:rFonts w:ascii="Consolas" w:eastAsia="Consolas" w:hAnsi="Consolas" w:cs="Consolas"/>
+          <w:color w:val="B42318"/>
+          <w:sz w:val="19"/>
+          <w:szCs w:val="19"/>
+        </w:rPr>
+        <w:t xml:space="preserve">clave(f, g)</w:t>
+      </w:r>
+      <w:r>
+        <w:t xml:space="preserve"> = </w:t>
+      </w:r>
+      <w:r>
+        <w:rPr>
+          <w:rFonts w:ascii="Consolas" w:eastAsia="Consolas" w:hAnsi="Consolas" w:cs="Consolas"/>
+          <w:color w:val="B42318"/>
+          <w:sz w:val="19"/>
+          <w:szCs w:val="19"/>
+        </w:rPr>
+        <w:t xml:space="preserve">fecha|grupo</w:t>
+      </w:r>
+      <w:r>
+        <w:t xml:space="preserve">), con las cargas lado a lado y un radio por carga. El pie de la tarjeta nombra las otras pesquisas de esa fecha que no tienen repetidas. </w:t>
       </w:r>
       <w:r>
         <w:rPr>
@@ -23319,6 +23548,43 @@
         <w:spacing w:after="60"/>
       </w:pPr>
       <w:r>
+        <w:t xml:space="preserve">Caso que motivó la agrupación por pesquisa (BD local de Colombia, centro 46, </w:t>
+      </w:r>
+      <w:r>
+        <w:rPr>
+          <w:rFonts w:ascii="Consolas" w:eastAsia="Consolas" w:hAnsi="Consolas" w:cs="Consolas"/>
+          <w:color w:val="B42318"/>
+          <w:sz w:val="19"/>
+          <w:szCs w:val="19"/>
+        </w:rPr>
+        <w:t xml:space="preserve">persona_id</w:t>
+      </w:r>
+      <w:r>
+        <w:t xml:space="preserve"> 1977810835, fecha 2023-04-05): antropometría tiene una sola carga y sanguíneo tiene 2 cargas de HEMOGLOBINA 10.30 (</w:t>
+      </w:r>
+      <w:r>
+        <w:rPr>
+          <w:rFonts w:ascii="Consolas" w:eastAsia="Consolas" w:hAnsi="Consolas" w:cs="Consolas"/>
+          <w:color w:val="B42318"/>
+          <w:sz w:val="19"/>
+          <w:szCs w:val="19"/>
+        </w:rPr>
+        <w:t xml:space="preserve">idunico</w:t>
+      </w:r>
+      <w:r>
+        <w:t xml:space="preserve"> 80389 y 80399); el plan elimina solo la 80399.</w:t>
+      </w:r>
+    </w:p>
+    <w:p>
+      <w:pPr>
+        <w:pStyle w:val="Prrafodelista"/>
+        <w:numPr>
+          <w:ilvl w:val="0"/>
+          <w:numId w:val="2"/>
+        </w:numPr>
+        <w:spacing w:after="60"/>
+      </w:pPr>
+      <w:r>
         <w:t xml:space="preserve">Para ejecutar </w:t>
       </w:r>
       <w:r>
@@ -26266,7 +26532,7 @@
                 <w:sz w:val="19"/>
                 <w:szCs w:val="19"/>
               </w:rPr>
-              <w:t xml:space="preserve">Eliminación de evaluaciones sin respaldo ni auditoría</w:t>
+              <w:t xml:space="preserve">Eliminación de evaluaciones sin respaldo</w:t>
             </w:r>
           </w:p>
         </w:tc>
@@ -26292,7 +26558,7 @@
                 <w:sz w:val="19"/>
                 <w:szCs w:val="19"/>
               </w:rPr>
-              <w:t xml:space="preserve">Solo queda el log (centro, modo, persona, cantidad, usuario_id); no se guarda copia de las filas borradas. Evaluar volcarlas a un JSON o a una tabla de auditoría antes del DELETE</w:t>
+              <w:t xml:space="preserve">Solo queda el log; no se guarda copia de las filas borradas. Evaluar volcarlas a un JSON o a una tabla de auditoría antes del DELETE</w:t>
             </w:r>
           </w:p>
         </w:tc>
@@ -26355,7 +26621,7 @@
                 <w:sz w:val="19"/>
                 <w:szCs w:val="19"/>
               </w:rPr>
-              <w:t xml:space="preserve">Evaluaciones duplicadas sin probar en Colombia ni El Salvador</w:t>
+              <w:t xml:space="preserve">Evaluaciones duplicadas: solo probado en Venezuela</w:t>
             </w:r>
           </w:p>
         </w:tc>
@@ -26381,7 +26647,7 @@
                 <w:sz w:val="19"/>
                 <w:szCs w:val="19"/>
               </w:rPr>
-              <w:t xml:space="preserve">Verificar en cada base los nombres de columnas (</w:t>
+              <w:t xml:space="preserve">Verificar en cada base las columnas </w:t>
             </w:r>
             <w:r>
               <w:rPr>
@@ -26429,7 +26695,23 @@
                 <w:sz w:val="19"/>
                 <w:szCs w:val="19"/>
               </w:rPr>
-              <w:t xml:space="preserve">) y las tablas </w:t>
+              <w:t xml:space="preserve"> y </w:t>
+            </w:r>
+            <w:r>
+              <w:rPr>
+                <w:rFonts w:ascii="Consolas" w:eastAsia="Consolas" w:hAnsi="Consolas" w:cs="Consolas"/>
+                <w:color w:val="B42318"/>
+                <w:sz w:val="19"/>
+                <w:szCs w:val="19"/>
+              </w:rPr>
+              <w:t xml:space="preserve">tipo_pesquisa_grupo</w:t>
+            </w:r>
+            <w:r>
+              <w:rPr>
+                <w:sz w:val="19"/>
+                <w:szCs w:val="19"/>
+              </w:rPr>
+              <w:t xml:space="preserve"> (y sus valores), y las tablas </w:t>
             </w:r>
             <w:r>
               <w:rPr>
@@ -26543,7 +26825,7 @@
                 <w:sz w:val="19"/>
                 <w:szCs w:val="19"/>
               </w:rPr>
-              <w:t xml:space="preserve">No revisa evaluaciones de campo (</w:t>
+              <w:t xml:space="preserve">No revisa </w:t>
             </w:r>
             <w:r>
               <w:rPr>
@@ -26559,7 +26841,7 @@
                 <w:sz w:val="19"/>
                 <w:szCs w:val="19"/>
               </w:rPr>
-              <w:t xml:space="preserve">) ni otras tablas; una recarga que las genere dejaría repetidas sin detectar</w:t>
+              <w:t xml:space="preserve"> ni otras tablas: una recarga que las genere dejaría repetidas sin detectar</w:t>
             </w:r>
           </w:p>
         </w:tc>

</xml_diff>